<commit_message>
docs: regenerate teaching-edition docx in A4 page format
Rebuild via an A4 reference doc (210x297 mm, 1in margins); content
unchanged - 102 native equations, all 39 formula numbers, TOC, embedded
figure. Was US Letter; now A4 to match the PDF.

Co-Authored-By: Claude Opus 4.8 (1M context) <noreply@anthropic.com>
Claude-Session: https://claude.ai/code/session_01HeihXJbBxn7PZLbRZtG23t
</commit_message>
<xml_diff>
--- a/docs/varcap-machine-design-guide-teaching.docx
+++ b/docs/varcap-machine-design-guide-teaching.docx
@@ -10469,7 +10469,7 @@
       <w:r>
         <w:drawing>
           <wp:inline>
-            <wp:extent cx="5334000" cy="2978150"/>
+            <wp:extent cx="5727700" cy="3197965"/>
             <wp:effectExtent b="0" l="0" r="0" t="0"/>
             <wp:docPr descr="Boomerang block cap — plan (twelve sector caps, alternating group rails) and section (axial foil/Mylar stack over the C-EM)." title="" id="42" name="Picture"/>
             <a:graphic>
@@ -10490,7 +10490,7 @@
                   <pic:spPr bwMode="auto">
                     <a:xfrm>
                       <a:off x="0" y="0"/>
-                      <a:ext cx="5334000" cy="2978150"/>
+                      <a:ext cx="5727700" cy="3197965"/>
                     </a:xfrm>
                     <a:prstGeom prst="rect">
                       <a:avLst/>
@@ -29192,7 +29192,10 @@
     </w:p>
     <w:bookmarkEnd w:id="84"/>
     <w:bookmarkEnd w:id="85"/>
-    <w:sectPr/>
+    <w:sectPr>
+      <w:pgSz w:h="16838" w:w="11906"/>
+      <w:pgMar w:bottom="1440" w:footer="720" w:gutter="0" w:header="720" w:left="1440" w:right="1440" w:top="1440"/>
+    </w:sectPr>
   </w:body>
 </w:document>
 </file>

</xml_diff>